<commit_message>
Them qr code vao web
</commit_message>
<xml_diff>
--- a/Noi_Dung_Thuyet_Trinh_MLN131.docx
+++ b/Noi_Dung_Thuyet_Trinh_MLN131.docx
@@ -56,7 +56,7 @@
     </w:p>
     <w:p>
       <w:pPr>
-        <w:spacing w:after="260" w:before="40"/>
+        <w:spacing w:after="60" w:before="40"/>
         <w:jc w:val="center"/>
       </w:pPr>
       <w:r>
@@ -69,6 +69,23 @@
           <w:szCs w:val="22"/>
         </w:rPr>
         <w:t xml:space="preserve">Chương 5 · Mục III (Từ trang 177 đến trang 187 Giáo trình chuẩn 2021) · Kỳ Fall2026</w:t>
+      </w:r>
+    </w:p>
+    <w:p>
+      <w:pPr>
+        <w:spacing w:after="200" w:before="20"/>
+        <w:jc w:val="center"/>
+      </w:pPr>
+      <w:r>
+        <w:rPr>
+          <w:rFonts w:ascii="Times New Roman" w:cs="Times New Roman" w:eastAsia="Times New Roman" w:hAnsi="Times New Roman"/>
+          <w:b/>
+          <w:bCs/>
+          <w:color w:val="1B365D"/>
+          <w:sz w:val="21"/>
+          <w:szCs w:val="21"/>
+        </w:rPr>
+        <w:t xml:space="preserve">Website tương tác trực tuyến: https://mln131-gamma.vercel.app/ (Quét mã QR khám phá trên điện thoại)</w:t>
       </w:r>
     </w:p>
     <w:p>
@@ -3159,7 +3176,7 @@
           <w:sz w:val="26"/>
           <w:szCs w:val="26"/>
         </w:rPr>
-        <w:t xml:space="preserve">Người 4: Thực tiễn Mô hình 4 Nhà ST25, Minigame &amp; Kết luận</w:t>
+        <w:t xml:space="preserve">Người 4: Thực tiễn Mô hình 4 Nhà ST25, Minigame, Quét mã QR &amp; Kết luận</w:t>
       </w:r>
     </w:p>
     <w:p>
@@ -3187,7 +3204,152 @@
           <w:sz w:val="22"/>
           <w:szCs w:val="22"/>
         </w:rPr>
-        <w:t xml:space="preserve">"Kính thưa Thầy Cô và các bạn! Minh chứng sinh động nhất của liên minh chính là mô hình 'Liên kết 4 Nhà' với kỳ tích hạt gạo ST25 hai lần đoạt giải Gạo ngon nhất thế giới: Nhà khoa học lai tạo giống, Nhà nước bảo hộ và quy hoạch, Doanh nghiệp đầu tư chế biến bao tiêu, và Nông dân canh tác công nghệ cao. Bây giờ, em xin kính mời Thầy Cô và cả lớp cùng tham gia 'Đấu trường Trắc nghiệm MLN131' gồm 5 câu hỏi trọng tâm ngay trên màn hình web tương tác! Chúng ta có thể tự do chọn, đổi đáp án và chuyển đổi giữa 5 câu hỏi. Sau khi cả lớp hoàn thành trọn vẹn, nút Nộp bài ở câu cuối sẽ mở ra đáp án đúng và lời giải thích khoa học chi tiết bám sát từng trang giáo trình!... Thay mặt nhóm, chúng em xin chân thành cảm ơn sự lắng nghe và đóng góp quý báu từ Thầy Cô và các bạn!"</w:t>
+        <w:t xml:space="preserve">"Kính thưa Thầy Cô và các bạn! Minh chứng sinh động nhất của liên minh chính là mô hình 'Liên kết 4 Nhà' với kỳ tích hạt gạo ST25 hai lần đoạt giải Gạo ngon nhất thế giới: Nhà khoa học lai tạo giống, Nhà nước bảo hộ và quy hoạch, Doanh nghiệp đầu tư chế biến bao tiêu, và Nông dân canh tác công nghệ cao. Bây giờ, em xin kính mời Thầy Cô và cả lớp cùng tham gia 'Đấu trường Trắc nghiệm MLN131' gồm 5 câu hỏi trọng tâm ngay trên màn hình web tương tác! Chúng ta có thể tự do chọn, đổi đáp án và chuyển đổi giữa 5 câu hỏi. Sau khi cả lớp hoàn thành trọn vẹn, nút Nộp bài ở câu cuối sẽ mở ra đáp án đúng và lời giải thích khoa học chi tiết bám sát từng trang giáo trình!... Và để Thầy Cô cùng các bạn có thể tự mình khám phá, làm lại trắc nghiệm bất cứ lúc nào, nhóm em trân trọng kính mời mọi người hướng camera điện thoại lên màn hình quét mã QR để truy cập trực tiếp trang web https://mln131-gamma.vercel.app/! Thay mặt nhóm, chúng em xin chân thành cảm ơn sự lắng nghe và đóng góp quý báu từ Thầy Cô và các bạn!"</w:t>
+      </w:r>
+    </w:p>
+    <w:p>
+      <w:pPr>
+        <w:pStyle w:val="Heading1"/>
+        <w:spacing w:after="140" w:before="360"/>
+      </w:pPr>
+      <w:r>
+        <w:rPr>
+          <w:rFonts w:ascii="Times New Roman" w:cs="Times New Roman" w:eastAsia="Times New Roman" w:hAnsi="Times New Roman"/>
+          <w:b/>
+          <w:bCs/>
+          <w:color w:val="8B1E1E"/>
+          <w:sz w:val="30"/>
+          <w:szCs w:val="30"/>
+        </w:rPr>
+        <w:t xml:space="preserve">PHẦN VII: TRẢI NGHIỆM TƯƠNG TÁC QUÉT MÃ QR (https://mln131-gamma.vercel.app/)</w:t>
+      </w:r>
+    </w:p>
+    <w:p>
+      <w:pPr>
+        <w:spacing w:after="100" w:line="300"/>
+      </w:pPr>
+      <w:r>
+        <w:rPr>
+          <w:rFonts w:ascii="Times New Roman" w:cs="Times New Roman" w:eastAsia="Times New Roman" w:hAnsi="Times New Roman"/>
+          <w:b w:val="false"/>
+          <w:bCs w:val="false"/>
+          <w:i w:val="false"/>
+          <w:iCs w:val="false"/>
+          <w:color w:val="1E1E24"/>
+          <w:sz w:val="22"/>
+          <w:szCs w:val="22"/>
+        </w:rPr>
+        <w:t xml:space="preserve">Nhóm thuyết trình đã triển khai toàn bộ bài báo cáo lên nền tảng Web tương tác công khai, giúp Giảng viên và Sinh viên dễ dàng tiếp cận mọi lúc, mọi nơi:</w:t>
+      </w:r>
+    </w:p>
+    <w:p>
+      <w:pPr>
+        <w:spacing w:after="100" w:line="300"/>
+      </w:pPr>
+      <w:r>
+        <w:rPr>
+          <w:rFonts w:ascii="Times New Roman" w:cs="Times New Roman" w:eastAsia="Times New Roman" w:hAnsi="Times New Roman"/>
+          <w:b/>
+          <w:bCs/>
+          <w:i w:val="false"/>
+          <w:iCs w:val="false"/>
+          <w:color w:val="1B365D"/>
+          <w:sz w:val="22"/>
+          <w:szCs w:val="22"/>
+        </w:rPr>
+        <w:t xml:space="preserve">• Địa chỉ truy cập chính thức: https://mln131-gamma.vercel.app/</w:t>
+      </w:r>
+    </w:p>
+    <w:p>
+      <w:pPr>
+        <w:pStyle w:val="ListParagraph"/>
+        <w:numPr>
+          <w:ilvl w:val="0"/>
+          <w:numId w:val="1"/>
+        </w:numPr>
+        <w:spacing w:after="100" w:line="300"/>
+      </w:pPr>
+      <w:r>
+        <w:rPr>
+          <w:rFonts w:ascii="Times New Roman" w:cs="Times New Roman" w:eastAsia="Times New Roman" w:hAnsi="Times New Roman"/>
+          <w:b w:val="false"/>
+          <w:bCs w:val="false"/>
+          <w:i w:val="false"/>
+          <w:iCs w:val="false"/>
+          <w:color w:val="1E1E24"/>
+          <w:sz w:val="22"/>
+          <w:szCs w:val="22"/>
+        </w:rPr>
+        <w:t xml:space="preserve">• Hướng dẫn quét mã QR: Mở ứng dụng Camera hoặc Zalo trên điện thoại thông minh, quét mã QR tại mục 'Quét mã để khám phá thêm' trên màn hình web hoặc slide báo cáo để mở trang web ngay trên điện thoại.</w:t>
+      </w:r>
+    </w:p>
+    <w:p>
+      <w:pPr>
+        <w:pStyle w:val="ListParagraph"/>
+        <w:numPr>
+          <w:ilvl w:val="0"/>
+          <w:numId w:val="1"/>
+        </w:numPr>
+        <w:spacing w:after="100" w:line="300"/>
+      </w:pPr>
+      <w:r>
+        <w:rPr>
+          <w:rFonts w:ascii="Times New Roman" w:cs="Times New Roman" w:eastAsia="Times New Roman" w:hAnsi="Times New Roman"/>
+          <w:b w:val="false"/>
+          <w:bCs w:val="false"/>
+          <w:i w:val="false"/>
+          <w:iCs w:val="false"/>
+          <w:color w:val="1E1E24"/>
+          <w:sz w:val="22"/>
+          <w:szCs w:val="22"/>
+        </w:rPr>
+        <w:t xml:space="preserve">• Đấu trường trắc nghiệm 5 câu hỏi trọng tâm: Tự do chọn và đổi đáp án, nộp bài nhận giải thích khoa học chi tiết có dẫn chứng trang giáo trình.</w:t>
+      </w:r>
+    </w:p>
+    <w:p>
+      <w:pPr>
+        <w:pStyle w:val="ListParagraph"/>
+        <w:numPr>
+          <w:ilvl w:val="0"/>
+          <w:numId w:val="1"/>
+        </w:numPr>
+        <w:spacing w:after="100" w:line="300"/>
+      </w:pPr>
+      <w:r>
+        <w:rPr>
+          <w:rFonts w:ascii="Times New Roman" w:cs="Times New Roman" w:eastAsia="Times New Roman" w:hAnsi="Times New Roman"/>
+          <w:b w:val="false"/>
+          <w:bCs w:val="false"/>
+          <w:i w:val="false"/>
+          <w:iCs w:val="false"/>
+          <w:color w:val="1E1E24"/>
+          <w:sz w:val="22"/>
+          <w:szCs w:val="22"/>
+        </w:rPr>
+        <w:t xml:space="preserve">• Khám phá trực quan 5 giai tầng: Số liệu thực tế, vai trò lãnh đạo của công nhân, chuyển mình của nông dân 4.0, trí thức và doanh nhân.</w:t>
+      </w:r>
+    </w:p>
+    <w:p>
+      <w:pPr>
+        <w:pStyle w:val="ListParagraph"/>
+        <w:numPr>
+          <w:ilvl w:val="0"/>
+          <w:numId w:val="1"/>
+        </w:numPr>
+        <w:spacing w:after="100" w:line="300"/>
+      </w:pPr>
+      <w:r>
+        <w:rPr>
+          <w:rFonts w:ascii="Times New Roman" w:cs="Times New Roman" w:eastAsia="Times New Roman" w:hAnsi="Times New Roman"/>
+          <w:b w:val="false"/>
+          <w:bCs w:val="false"/>
+          <w:i w:val="false"/>
+          <w:iCs w:val="false"/>
+          <w:color w:val="1E1E24"/>
+          <w:sz w:val="22"/>
+          <w:szCs w:val="22"/>
+        </w:rPr>
+        <w:t xml:space="preserve">• Sơ đồ tương tác Tam giác Liên minh &amp; Mô hình 4 Nhà ST25: Trực quan hóa sinh động, mượt mà trên mọi kích cỡ màn hình di động.</w:t>
       </w:r>
     </w:p>
     <w:sectPr>

</xml_diff>

<commit_message>
Update nội dung thuyết trình phần cơ cấu xã hội giai cấp
</commit_message>
<xml_diff>
--- a/Noi_Dung_Thuyet_Trinh_MLN131.docx
+++ b/Noi_Dung_Thuyet_Trinh_MLN131.docx
@@ -914,7 +914,7 @@
                 <w:sz w:val="21"/>
                 <w:szCs w:val="21"/>
               </w:rPr>
-              <w:t xml:space="preserve">Phụ nữ &amp; Thế hệ Trẻ (Thanh niên)</w:t>
+              <w:t xml:space="preserve">Tính tất yếu của khối Liên minh</w:t>
             </w:r>
           </w:p>
         </w:tc>
@@ -941,7 +941,7 @@
                 <w:sz w:val="21"/>
                 <w:szCs w:val="21"/>
               </w:rPr>
-              <w:t xml:space="preserve">Bình đẳng giới; rường cột tương lai, lực lượng xung kích trong chuyển đổi số và đổi mới sáng tạo quốc gia.</w:t>
+              <w:t xml:space="preserve">Tất yếu về Chính trị (nền tảng Nhà nước), Kinh tế (gắn kết sản xuất), Văn hóa - Xã hội (công bằng, ấm no).</w:t>
             </w:r>
           </w:p>
         </w:tc>
@@ -968,7 +968,7 @@
                 <w:sz w:val="21"/>
                 <w:szCs w:val="21"/>
               </w:rPr>
-              <w:t xml:space="preserve">Trang 182 – 183</w:t>
+              <w:t xml:space="preserve">Trang 183 – 184</w:t>
             </w:r>
           </w:p>
         </w:tc>
@@ -997,7 +997,7 @@
                 <w:sz w:val="21"/>
                 <w:szCs w:val="21"/>
               </w:rPr>
-              <w:t xml:space="preserve">Tính tất yếu của khối Liên minh</w:t>
+              <w:t xml:space="preserve">Nội dung Kinh tế của Liên minh</w:t>
             </w:r>
           </w:p>
         </w:tc>
@@ -1024,7 +1024,7 @@
                 <w:sz w:val="21"/>
                 <w:szCs w:val="21"/>
               </w:rPr>
-              <w:t xml:space="preserve">Tất yếu về Chính trị (nền tảng Nhà nước), Kinh tế (gắn kết sản xuất), Văn hóa - Xã hội (công bằng, ấm no).</w:t>
+              <w:t xml:space="preserve">Nội dung CƠ BẢN, QUYẾT ĐỊNH NHẤT; Lợi ích kinh tế là động lực trực tiếp gắn kết các bên.</w:t>
             </w:r>
           </w:p>
         </w:tc>
@@ -1051,7 +1051,7 @@
                 <w:sz w:val="21"/>
                 <w:szCs w:val="21"/>
               </w:rPr>
-              <w:t xml:space="preserve">Trang 183 – 184</w:t>
+              <w:t xml:space="preserve">Trang 184 – 185</w:t>
             </w:r>
           </w:p>
         </w:tc>
@@ -1080,7 +1080,7 @@
                 <w:sz w:val="21"/>
                 <w:szCs w:val="21"/>
               </w:rPr>
-              <w:t xml:space="preserve">Nội dung Kinh tế của Liên minh</w:t>
+              <w:t xml:space="preserve">Nội dung Chính trị của Liên minh</w:t>
             </w:r>
           </w:p>
         </w:tc>
@@ -1107,7 +1107,7 @@
                 <w:sz w:val="21"/>
                 <w:szCs w:val="21"/>
               </w:rPr>
-              <w:t xml:space="preserve">Nội dung CƠ BẢN, QUYẾT ĐỊNH NHẤT; Lợi ích kinh tế là động lực trực tiếp gắn kết các bên.</w:t>
+              <w:t xml:space="preserve">Giữ vững vai trò lãnh đạo duy nhất của Đảng; củng cố Nhà nước của Nhân dân; phát huy dân chủ XHCN.</w:t>
             </w:r>
           </w:p>
         </w:tc>
@@ -1134,7 +1134,7 @@
                 <w:sz w:val="21"/>
                 <w:szCs w:val="21"/>
               </w:rPr>
-              <w:t xml:space="preserve">Trang 184 – 185</w:t>
+              <w:t xml:space="preserve">Trang 185</w:t>
             </w:r>
           </w:p>
         </w:tc>
@@ -1163,7 +1163,7 @@
                 <w:sz w:val="21"/>
                 <w:szCs w:val="21"/>
               </w:rPr>
-              <w:t xml:space="preserve">Nội dung Chính trị của Liên minh</w:t>
+              <w:t xml:space="preserve">Nội dung Văn hóa - Xã hội</w:t>
             </w:r>
           </w:p>
         </w:tc>
@@ -1190,7 +1190,7 @@
                 <w:sz w:val="21"/>
                 <w:szCs w:val="21"/>
               </w:rPr>
-              <w:t xml:space="preserve">Giữ vững vai trò lãnh đạo duy nhất của Đảng; củng cố Nhà nước của Nhân dân; phát huy dân chủ XHCN.</w:t>
+              <w:t xml:space="preserve">Thước đo tính ưu việt nhân văn; phát triển kinh tế gắn với công bằng xã hội ('Không để ai bị bỏ lại phía sau').</w:t>
             </w:r>
           </w:p>
         </w:tc>
@@ -1217,89 +1217,6 @@
                 <w:sz w:val="21"/>
                 <w:szCs w:val="21"/>
               </w:rPr>
-              <w:t xml:space="preserve">Trang 185</w:t>
-            </w:r>
-          </w:p>
-        </w:tc>
-      </w:tr>
-      <w:tr>
-        <w:tc>
-          <w:tcPr>
-            <w:tcW w:type="pct" w:w="35%"/>
-            <w:tcMar>
-              <w:top w:type="dxa" w:w="100"/>
-              <w:left w:type="dxa" w:w="140"/>
-              <w:bottom w:type="dxa" w:w="100"/>
-              <w:right w:type="dxa" w:w="140"/>
-            </w:tcMar>
-          </w:tcPr>
-          <w:p>
-            <w:pPr>
-              <w:jc w:val="left"/>
-            </w:pPr>
-            <w:r>
-              <w:rPr>
-                <w:rFonts w:ascii="Times New Roman" w:cs="Times New Roman" w:eastAsia="Times New Roman" w:hAnsi="Times New Roman"/>
-                <w:b/>
-                <w:bCs/>
-                <w:color w:val="1E1E24"/>
-                <w:sz w:val="21"/>
-                <w:szCs w:val="21"/>
-              </w:rPr>
-              <w:t xml:space="preserve">Nội dung Văn hóa - Xã hội</w:t>
-            </w:r>
-          </w:p>
-        </w:tc>
-        <w:tc>
-          <w:tcPr>
-            <w:tcW w:type="pct" w:w="45%"/>
-            <w:tcMar>
-              <w:top w:type="dxa" w:w="100"/>
-              <w:left w:type="dxa" w:w="140"/>
-              <w:bottom w:type="dxa" w:w="100"/>
-              <w:right w:type="dxa" w:w="140"/>
-            </w:tcMar>
-          </w:tcPr>
-          <w:p>
-            <w:pPr>
-              <w:jc w:val="left"/>
-            </w:pPr>
-            <w:r>
-              <w:rPr>
-                <w:rFonts w:ascii="Times New Roman" w:cs="Times New Roman" w:eastAsia="Times New Roman" w:hAnsi="Times New Roman"/>
-                <w:b w:val="false"/>
-                <w:bCs w:val="false"/>
-                <w:color w:val="1E1E24"/>
-                <w:sz w:val="21"/>
-                <w:szCs w:val="21"/>
-              </w:rPr>
-              <w:t xml:space="preserve">Thước đo tính ưu việt nhân văn; phát triển kinh tế gắn với công bằng xã hội ('Không để ai bị bỏ lại phía sau').</w:t>
-            </w:r>
-          </w:p>
-        </w:tc>
-        <w:tc>
-          <w:tcPr>
-            <w:tcW w:type="pct" w:w="20%"/>
-            <w:tcMar>
-              <w:top w:type="dxa" w:w="100"/>
-              <w:left w:type="dxa" w:w="140"/>
-              <w:bottom w:type="dxa" w:w="100"/>
-              <w:right w:type="dxa" w:w="140"/>
-            </w:tcMar>
-          </w:tcPr>
-          <w:p>
-            <w:pPr>
-              <w:jc w:val="center"/>
-            </w:pPr>
-            <w:r>
-              <w:rPr>
-                <w:rFonts w:ascii="Times New Roman" w:cs="Times New Roman" w:eastAsia="Times New Roman" w:hAnsi="Times New Roman"/>
-                <w:b/>
-                <w:bCs/>
-                <w:color w:val="1E1E24"/>
-                <w:sz w:val="21"/>
-                <w:szCs w:val="21"/>
-              </w:rPr>
               <w:t xml:space="preserve">Trang 185 – 186</w:t>
             </w:r>
           </w:p>
@@ -1532,7 +1449,7 @@
           <w:sz w:val="30"/>
           <w:szCs w:val="30"/>
         </w:rPr>
-        <w:t xml:space="preserve">PHẦN II: CƠ CẤU VÀ ĐẶC ĐIỂM BIẾN ĐỔI CỦA 5 GIAI TẦNG TRỤ CỘT Ở VIỆT NAM</w:t>
+        <w:t xml:space="preserve">PHẦN II: CƠ CẤU VÀ ĐẶC ĐIỂM BIẾN ĐỔI CỦA 4 GIAI CẤP, TẦNG LỚP CỐT LÕI Ở VIỆT NAM (Trang 178 – 182)</w:t>
       </w:r>
     </w:p>
     <w:p>
@@ -1969,69 +1886,6 @@
           <w:szCs w:val="22"/>
         </w:rPr>
         <w:t xml:space="preserve">• Mối quan hệ với công nhân: Quan hệ 'vừa hợp tác, vừa đấu tranh': Hợp tác sản xuất tạo của cải; đấu tranh qua tổ chức Công đoàn để bảo đảm quyền lợi, tiền lương, an toàn lao động.</w:t>
-      </w:r>
-    </w:p>
-    <w:p>
-      <w:pPr>
-        <w:pStyle w:val="Heading2"/>
-        <w:spacing w:after="100" w:before="260"/>
-      </w:pPr>
-      <w:r>
-        <w:rPr>
-          <w:rFonts w:ascii="Times New Roman" w:cs="Times New Roman" w:eastAsia="Times New Roman" w:hAnsi="Times New Roman"/>
-          <w:b/>
-          <w:bCs/>
-          <w:color w:val="1B365D"/>
-          <w:sz w:val="26"/>
-          <w:szCs w:val="26"/>
-        </w:rPr>
-        <w:t xml:space="preserve">5. Tầng lớp Phụ nữ và Thế hệ Trẻ (Trang 182 – 183)</w:t>
-      </w:r>
-    </w:p>
-    <w:p>
-      <w:pPr>
-        <w:pStyle w:val="ListParagraph"/>
-        <w:numPr>
-          <w:ilvl w:val="0"/>
-          <w:numId w:val="1"/>
-        </w:numPr>
-        <w:spacing w:after="100" w:line="300"/>
-      </w:pPr>
-      <w:r>
-        <w:rPr>
-          <w:rFonts w:ascii="Times New Roman" w:cs="Times New Roman" w:eastAsia="Times New Roman" w:hAnsi="Times New Roman"/>
-          <w:b w:val="false"/>
-          <w:bCs w:val="false"/>
-          <w:i w:val="false"/>
-          <w:iCs w:val="false"/>
-          <w:color w:val="1E1E24"/>
-          <w:sz w:val="22"/>
-          <w:szCs w:val="22"/>
-        </w:rPr>
-        <w:t xml:space="preserve">• Phụ nữ Việt Nam: Chiếm hơn 50% dân số, phát huy truyền thống 'Anh hùng, bất khuất, trung hậu, đảm đang' và 'Giỏi việc nước, đảm việc nhà'; tỷ lệ nữ Đại biểu Quốc hội khóa XV đạt trên 30% (cao hàng đầu khu vực ASEAN).</w:t>
-      </w:r>
-    </w:p>
-    <w:p>
-      <w:pPr>
-        <w:pStyle w:val="ListParagraph"/>
-        <w:numPr>
-          <w:ilvl w:val="0"/>
-          <w:numId w:val="1"/>
-        </w:numPr>
-        <w:spacing w:after="100" w:line="300"/>
-      </w:pPr>
-      <w:r>
-        <w:rPr>
-          <w:rFonts w:ascii="Times New Roman" w:cs="Times New Roman" w:eastAsia="Times New Roman" w:hAnsi="Times New Roman"/>
-          <w:b w:val="false"/>
-          <w:bCs w:val="false"/>
-          <w:i w:val="false"/>
-          <w:iCs w:val="false"/>
-          <w:color w:val="1E1E24"/>
-          <w:sz w:val="22"/>
-          <w:szCs w:val="22"/>
-        </w:rPr>
-        <w:t xml:space="preserve">• Thế hệ Trẻ (Thanh niên, Sinh viên): Chiếm hơn 22 triệu dân số (lợi thế dân số vàng), là rường cột tương lai, xung kích đi đầu trong học tập, nghiên cứu khoa học, khởi nghiệp và chuyển đổi số quốc gia.</w:t>
       </w:r>
     </w:p>
     <w:p>
@@ -3086,7 +2940,7 @@
           <w:sz w:val="26"/>
           <w:szCs w:val="26"/>
         </w:rPr>
-        <w:t xml:space="preserve">Người 2: Chi tiết 5 Giai tầng trụ cột ở Việt Nam (Trang 178 – 183)</w:t>
+        <w:t xml:space="preserve">Người 2: Chi tiết 4 Giai cấp, Tầng lớp cốt lõi ở Việt Nam (Trang 178 – 182)</w:t>
       </w:r>
     </w:p>
     <w:p>
@@ -3114,7 +2968,7 @@
           <w:sz w:val="22"/>
           <w:szCs w:val="22"/>
         </w:rPr>
-        <w:t xml:space="preserve">"Xin cảm ơn bạn A! Kính thưa Thầy Cô, cơ cấu giai tầng nước ta hiện nay quy tụ 5 trụ cột: Thứ nhất, Công nhân là giai cấp lãnh đạo cách mạng qua Đảng, tiên phong CNH-HĐH, chiếm hơn 17 triệu lao động và trên 60% GDP, đang chuyển dịch thành 'công nhân áo trắng' tri thức. Thứ hai, Nông dân chiếm hơn 60% dân số, vị trí chiến lược Tam Nông, nay đã là 'nông dân 4.0' đưa xuất khẩu nông sản vượt 53 tỷ USD. Thứ ba, Trí thức là vốn quý của dân tộc, lực lượng nòng cốt kinh tế tri thức với hơn 6.5 triệu người. Thứ tư, Doanh nhân là lực lượng xung kích phát triển kinh tế thị trường, tạo ra hơn 85% việc làm mới. Và thứ năm là Phụ nữ bình đẳng giỏi việc nước đảm việc nhà, cùng Thế hệ trẻ thanh niên sinh viên xung kích chuyển đổi số quốc gia!"</w:t>
+        <w:t xml:space="preserve">"Xin cảm ơn bạn A! Kính thưa Thầy Cô, cơ cấu giai tầng nước ta hiện nay quy tụ 4 giai cấp, tầng lớp cốt lõi chuẩn theo Giáo trình trang 178 – 182: Thứ nhất, Công nhân là giai cấp lãnh đạo cách mạng qua Đảng, tiên phong CNH-HĐH, chiếm hơn 17 triệu lao động và trên 60% GDP, đang chuyển dịch thành 'công nhân áo trắng' tri thức. Thứ hai, Nông dân chiếm hơn 60% dân số, vị trí chiến lược Tam Nông, nay đã là 'nông dân 4.0' đưa xuất khẩu nông sản vượt 53 tỷ USD. Thứ ba, Trí thức là vốn quý của dân tộc, lực lượng nòng cốt kinh tế tri thức với hơn 6.5 triệu người. Và thứ tư, Doanh nhân là lực lượng xung kích phát triển kinh tế thị trường, tạo ra hơn 85% việc làm mới và trên 50% GDP cho toàn xã hội. Bốn lực lượng này gắn bó mật thiết, tạo nên nền tảng vững chắc cho công cuộc đổi mới đất nước!"</w:t>
       </w:r>
     </w:p>
     <w:p>
@@ -3326,7 +3180,7 @@
           <w:sz w:val="22"/>
           <w:szCs w:val="22"/>
         </w:rPr>
-        <w:t xml:space="preserve">• Khám phá trực quan 5 giai tầng: Số liệu thực tế, vai trò lãnh đạo của công nhân, chuyển mình của nông dân 4.0, trí thức và doanh nhân.</w:t>
+        <w:t xml:space="preserve">• Khám phá trực quan 4 giai cấp, tầng lớp cốt lõi: Số liệu thực tế, vai trò lãnh đạo của công nhân, chuyển mình của nông dân 4.0, trí thức và doanh nhân.</w:t>
       </w:r>
     </w:p>
     <w:p>

</xml_diff>